<commit_message>
Fix popup stats persistence and refresh project docs
</commit_message>
<xml_diff>
--- a/9_Слынчук_ИИ_Проект.docx
+++ b/9_Слынчук_ИИ_Проект.docx
@@ -122,12 +122,7 @@
         </w:rPr>
       </w:pPr>
       <w:r>
-        <w:rPr>
-          <w:b/>
-          <w:sz w:val="48"/>
-          <w:szCs w:val="48"/>
-        </w:rPr>
-        <w:t>Разработка концепции браузерного расширения «Cenz Control» для фильтрации нецензурной лексики и ограничения доступа к запрещённому веб-контенту</w:t>
+        <w:t>?????????? ??????????? ?????????? ?Cenz Control? ??? ?????????? ??????????? ??????? ? ??????????? ??????? ? ???????????? ???-????????</w:t>
       </w:r>
     </w:p>
     <w:p>
@@ -1294,7 +1289,7 @@
     </w:p>
     <w:p>
       <w:r>
-        <w:t>Объектом исследования является текстовый контент веб-страниц и механизмы ограничения доступа к опасным интернет-ресурсам. Предмет исследования составляют методы автоматической фильтрации нецензурной лексики и блокирования веб-ресурсов, содержащих запрещённую или противоправную информацию. Цель работы заключается в разработке концепции браузерного расширения «Cenz Control», предназначенного для цензурирования нецензурной лексики, ограничения доступа к запрещённым сайтам и последующего развития в сторону интеллектуальной, контекстно-зависимой замены нежелательных выражений.</w:t>
+        <w:t>???????? ???????????? ???????? ????????? ??????? ???-??????? ? ????????? ??????????? ??????? ? ??????? ????????-????????. ??????? ???????????? ?????????? ?????? ?????????????? ?????????? ??????????? ??????? ? ???????????? ???-????????, ?????????? ??????????? ??? ?????????????? ??????????. ???? ?????? ??????????? ? ?????????? ??????????? ?????????? ?Cenz Control?, ??????? ??????????? ??????????? ???????, ???????????? ?????? ? ??????????? ?????? ? ?????????? ??????????? ??????? bundle ?? ???????? ??????, ??????? ? ??????????. ???????????? ??????????? ???????? ???????? ??????????-????????? ?????? ????????????? ????????? ? ?????????????? ?????????????? ??????????.</w:t>
       </w:r>
     </w:p>
     <w:p>
@@ -1510,31 +1505,27 @@
     </w:p>
     <w:p>
       <w:r>
-        <w:t>Основная функция расширения заключается в двухуровневой защите. Первый уровень связан с недопущением загрузки запрещённых сайтов. Если адрес страницы совпадает с доменом или указателем страницы, содержащимся в актуальном внешнем перечне, расширение должно остановить переход и показать информационное уведомление о причине ограничения доступа. Второй уровень связан с анализом текста на тех страницах, которые не заблокированы полностью, но содержат нежелательные выражения. В этом случае расширение не запрещает чтение материала целиком, а очищает отображаемый текст от бранных и иных нежелательных словоформ.</w:t>
-      </w:r>
-    </w:p>
-    <w:p>
-      <w:r>
-        <w:t>С точки зрения пользовательского опыта важно, чтобы расширение не было «чёрным ящиком». Поэтому концепция «Cenz Control» предусматривает возможность открытия интерфейса и изменения параметров работы. Пользователь или его законный представитель должен иметь доступ к всплывающему окну расширения, в котором отображается текущий статус фильтрации, количество срабатываний, дата последнего обновления словаря и перечня ресурсов, а также основные режимы работы. При необходимости может быть реализована отдельная страница настроек с более подробными параметрами.</w:t>
-      </w:r>
-    </w:p>
-    <w:p>
-      <w:r>
-        <w:t xml:space="preserve">Среди настраиваемых опций целесообразно предусмотреть включение и отключение отдельных модулей, выбор степени строгости фильтрации, режим маскировки слов, режим полной замены, возможность временно отключить </w:t>
-      </w:r>
-      <w:r>
-        <w:lastRenderedPageBreak/>
-        <w:t>цензурирование на доверенном образовательном сайте, просмотр истории обновлений и управление пользовательским списком исключений. Наличие таких функций повышает применимость проекта в реальной жизни: один и тот же инструмент может использоваться и для школьного компьютера, и для домашнего браузера, и для самостоятельной организации цифровой гигиены.</w:t>
-      </w:r>
-    </w:p>
-    <w:p>
-      <w:r>
-        <w:t>Отдельной проектной задачей является прозрачность решения. Пользователь должен понимать, почему именно страница была заблокирована или почему фрагмент текста был изменён. Поэтому для расширения важно предусмотреть короткие поясняющие уведомления: например, указание на то, что ресурс присутствует в актуальном перечне ограничиваемых адресов либо что на странице обнаружены выражения, попадающие под словарную фильтрацию. Такая открытость делает работу системы более понятной и способствует формированию осознанного отношения к безопасному потреблению интернет-контента.</w:t>
-      </w:r>
-    </w:p>
-    <w:p>
-      <w:r>
-        <w:t>Таким образом, концепция «Cenz Control» объединяет защитную, образовательную и пользовательскую функции. Расширение не просто скрывает опасный или грубый контент, но и создаёт для подростка более безопасную среду чтения, в которой веб-страница становится менее агрессивной и менее рискованной с точки зрения случайного попадания на запрещённый ресурс.</w:t>
+        <w:t>???????? ??????? ?????????????? ?????????? ??????????? ? ????????????? ??????. ?????? ??????? ?????? ? ???????????? ???????? ??????????? ??????: ???? ????? ????????? ? ???????, hostname ??? ???????? URL ?? ?????? ??????????, ??????? ???????????????? ?? ????????? ???????? ? ???????????? ? ??????? ??????????? ???????. ?????? ??????? ???????? ?? ??????????? ????????? ? ???????? ?? ?????????????? ??????: ?????????? ??????????? ?????????? ???????? ? ???????? ??????????? ? ???? ????????????? ?????????? ??? ??????????? HTML-????????.</w:t>
+      </w:r>
+    </w:p>
+    <w:p>
+      <w:r>
+        <w:t>? ????? ?????? ????????????????? ????? ? ??????? ??????????? ??????????? ???? ??????????, ? ??????? ???????????? ??????? ?????, ????????? ??????? ?????????? ? ??????????, ?????????? ??????????????? ????, ????? ??????????? ????????? ????? ? ???? ?????????? ?????????? bundle. ????????????? ????????????? ????????? ???????? ????????, ??? ????? ???????? ????????? ?????? ? ???????? ??????????? ??????.</w:t>
+      </w:r>
+    </w:p>
+    <w:p>
+      <w:r>
+        <w:t>???????????????? ????????? ???????? ????????? ? ?????????? ????????? ???????, ????? ??????? ????????? ??????????, ????? ?????? ????, ??????????? ?????-????????, ?????? ?????????? ??????, ???????????????? ??????????, ?????? ?? ????????? bundle ? ?????? ??????????????? ??????????. ????????? ????? ???? ? ?? ?? ?????????? ????? ?????????????? ??? ? ???????? ??????, ??? ? ? ??????? ????? ? ????? ???????? ?????????????.</w:t>
+      </w:r>
+    </w:p>
+    <w:p>
+      <w:r>
+        <w:t>????????? ???????? ??????? ???????????? ??????. ??? ?????????? ????? ???????????? ???????????? ????????? ???????? ? ???????????? ? ???, ??? ????????? ??????? ????????? ????????????????? ?????????? ?????????, ? ????? ???????????? ???????? ? ??? ?????????? ???????. ???? ???????? ?? ??????????? ?????????, popup ?????????, ???????? ?? ??????? ???? ? ??????????? ?? ?? ??? ????????? ??????????.</w:t>
+      </w:r>
+    </w:p>
+    <w:p>
+      <w:r>
+        <w:t>????? ???????, ???????????? ?????????? ?Cenz Control? ?????????? ????????, ?????????????? ? ???????????????? ???????. ?????????? ?? ?????? ???????? ?????? ?????????, ?? ? ???????? ???????????? ????????, ????? ??????????? ?????????, ?????? ???????? ?????? ? ? ????? ?????? ??????? ????????? ?? ??????? ????????.</w:t>
       </w:r>
     </w:p>
     <w:p>
@@ -1554,73 +1545,37 @@
     </w:p>
     <w:p>
       <w:r>
-        <w:t xml:space="preserve">Ключевое требование к проекту состоит в том, чтобы списки запрещённых сайтов и словарные данные не хранились внутри расширения в статическом виде. Если словарь и перечень ресурсов обновляются только вместе с новой версией расширения, система очень быстро теряет актуальность. Поэтому в предлагаемой архитектуре предусмотрен внешний контур обновления данных: отдельный скрипт-парсер периодически получает сведения из официальных источников, обрабатывает их, формирует единый машиночитаемый файл и публикует его в репозитории </w:t>
-      </w:r>
-      <w:proofErr w:type="spellStart"/>
-      <w:r>
-        <w:t>GitHub</w:t>
-      </w:r>
-      <w:proofErr w:type="spellEnd"/>
-      <w:r>
-        <w:t>.</w:t>
-      </w:r>
-    </w:p>
-    <w:p>
-      <w:r>
-        <w:t xml:space="preserve">Содержательно такой внешний контур должен работать по принципу «один источник обработки - много пользователей». Вместо того чтобы каждое установленное расширение самостоятельно обращалось к разным государственным сайтам, парсер один раз собирает открыто доступные сведения, нормализует формат записей, устраняет дубли, добавляет дату обновления и формирует итоговые файлы. Далее расширение при запуске загружает уже подготовленные данные из репозитория </w:t>
-      </w:r>
-      <w:proofErr w:type="spellStart"/>
-      <w:r>
-        <w:t>GitHub</w:t>
-      </w:r>
-      <w:proofErr w:type="spellEnd"/>
-      <w:r>
-        <w:t xml:space="preserve"> по стабильной ссылке, при необходимости сохраняет их в локальный кэш и использует до следующего обновления.</w:t>
-      </w:r>
-    </w:p>
-    <w:p>
-      <w:r>
-        <w:t xml:space="preserve">Предлагаемая модель обладает рядом преимуществ. Во-первых, она позволяет централизованно контролировать качество и структуру данных. Во-вторых, обеспечивает прозрачность: пользователь и разработчик могут видеть, когда именно перечень был обновлён и какие изменения в него внесены. В-третьих, </w:t>
-      </w:r>
-      <w:proofErr w:type="spellStart"/>
-      <w:r>
-        <w:t>GitHub</w:t>
-      </w:r>
-      <w:proofErr w:type="spellEnd"/>
-      <w:r>
-        <w:t xml:space="preserve"> служит удобной площадкой для хранения версий, что позволяет при необходимости сравнивать редакции списков, откатывать </w:t>
-      </w:r>
-      <w:r>
-        <w:lastRenderedPageBreak/>
-        <w:t>ошибочные обновления и сопровождать проект в открытом формате. В-четвёртых, расширение получает компактный и заранее подготовленный набор сведений, а значит, работает быстрее и стабильнее.</w:t>
-      </w:r>
-    </w:p>
-    <w:p>
-      <w:r>
-        <w:t>С практической точки зрения целесообразно разделить данные как минимум на три файла. Первый файл содержит перечень доменов, указателей страниц и иных идентификаторов веб-ресурсов, доступ к которым должен ограничиваться. Второй файл содержит словарь нежелательных лексем, их базовые формы, устойчивые искажённые варианты и вспомогательные шаблоны для распознавания. Третий файл представляет собой список исключений, то есть нейтральных слов и выражений, которые могут случайно совпасть с частью запрещённого шаблона, но не должны подвергаться цензуре.</w:t>
-      </w:r>
-    </w:p>
-    <w:p>
-      <w:r>
-        <w:t>Важно подчеркнуть, что в рамках данного проекта речь идёт о концептуальном описании архитектуры, а не о фактической реализации парсера. Однако уже на этапе проектирования необходимо заложить требования к качеству данных: каждая запись должна иметь источник, дату актуализации и однозначный формат. Для списка сайтов полезно хранить домен, тип совпадения, примечание о происхождении записи и временную метку обновления. Для словаря слов целесообразно хранить лемму, вариант написания, категорию нежелательности, правила проверки и связь со списком исключений.</w:t>
-      </w:r>
-    </w:p>
-    <w:p>
-      <w:r>
-        <w:t xml:space="preserve">При запуске браузера расширение должно обращаться к </w:t>
-      </w:r>
-      <w:proofErr w:type="spellStart"/>
-      <w:r>
-        <w:t>GitHub</w:t>
-      </w:r>
-      <w:proofErr w:type="spellEnd"/>
-      <w:r>
-        <w:t>-репозиторию, проверять наличие более свежей версии файлов, скачивать её при необходимости и сохранять локально. Если пользователь временно работает без интернета, система должна продолжать функционировать на основе последней доступной копии. Такой режим повышает устойчивость решения и делает его пригодным для регулярного применения в учебной среде, где стабильность интерфейса и предсказуемость поведения имеют большое значение.</w:t>
-      </w:r>
-    </w:p>
-    <w:p>
-      <w:r>
-        <w:t>Следовательно, внешний контур обновления данных является принципиальной частью проекта. Именно он позволяет сделать «Cenz Control» не одноразовым экспериментом, а поддерживаемой системой, которая сохраняет актуальность без постоянной ручной переустановки расширения.</w:t>
+        <w:t>???????? ?????????? ??????? ???? ??????????? ????? ??????? ?????? ?????????? ??????. ?????? ??????????? ??????, ????????? ??????? ? ?????????? ?????????? ?????????? ?????????, ????????????? ? ?????? bundle-???? ? ????? ????????????? ? GitHub-??????????? ??? ??????? ????? ?????? ??????????.</w:t>
+      </w:r>
+    </w:p>
+    <w:p>
+      <w:r>
+        <w:t>? ??????? ??????????? ???????? ??????? ?????????? ??????? ????????? ??????????? Re-filter-lists, ?? ???????? ????????????? ??????? ?????? domains_all.lst. ? ???? ??????????? ?????????? ????????? adult-??????, ? ????? ????? ???? ?????????? ???????? ????????????? ????? ????????? ??????. ?? ?????? ?????????? ?????? ???????? bundle ???????? ????? 80 ????? ??????? ??? ??????????.</w:t>
+      </w:r>
+    </w:p>
+    <w:p>
+      <w:r>
+        <w:t>??? ?????? ? ??????? ????????????? ??? ??????????? ????????? ??????-??????, ??????? ????? ????????? ???????? ? ???????? XML, CSV, JSON, TXT ? ?????????????? ?????????. ? ???? ?????????? ?? ??? ???????? ?? ???????? sample-????????, ? ??? ??????? ????????? ????? ????? ?????????????? ??? ?????????? ?????? bundle ???????????? ???????.</w:t>
+      </w:r>
+    </w:p>
+    <w:p>
+      <w:r>
+        <w:t>???????? bundle ??????? ?? ???? ???????? ??????. ?????? ????? ? blockedSites, ?????????? ??????, hostname ? URL-??????? ??????????? ????????. ?????? ????? ? dictionary, ?????????? ????????? ???????, ?????? ??????? ? regex-??????? ??? ????????????? ????????????? ?????????. ?????? ????? ? exceptions, ??? ???????? ?????, ?????????? ??????? ?? ?????? ????????????.</w:t>
+      </w:r>
+    </w:p>
+    <w:p>
+      <w:r>
+        <w:t>? ??????? ?? ??????????????? ?????????? ???????, ?????? ???????? ??? ?? ?????? ??????, ?? ? ??????????. ?????? build_bundle.py ???????? ???????? JSON-????, GitHub-???????????? ?????? raw-?????? ?? ?????????????? bundle, ? ???? ?????????? ?????????? ??????? ?????????? ??????? URL ? ?????????? ? GitHub Raw ? ????????? fallback?. ????? ????? ????????? ???????? ? ? ????, ? ??? ????????? ?????????? ??????? ? ?????????? ???????????.</w:t>
+      </w:r>
+    </w:p>
+    <w:p>
+      <w:r>
+        <w:t>?????????????? ?????????? ????????? ?? ???? ???????. ? ????? ?????????? ???????? ???????????? ??????, ??????????? ??????? ????? ??????? bundle, ? ? ??????????? ????? ??????????? GitHub Actions workflow, ??????? ??? ? ?????? ???????????? ?????? ? ????????? ??????????? ????. ????????? ????? ???????????? ???????? ?????????? ?????? ??? ?????? ????????????? ??????????.</w:t>
+      </w:r>
+    </w:p>
+    <w:p>
+      <w:r>
+        <w:t>?????????????, ??????? ?????? ?????????? ?????? ???? ?? ????????????? ???????????, ? ??????????? ?????? ???????? ???????. ?????? ?? ???????????? ????????????? ???????, ????????????????? ?????? ? ??????????? ??????????????? ????????? ?????? ?????? ? ??????? ??????????.</w:t>
       </w:r>
     </w:p>
     <w:p>
@@ -1635,45 +1590,37 @@
     </w:p>
     <w:p>
       <w:r>
-        <w:t>После загрузки разрешённой веб-страницы расширение должно переходить к анализу её текстового содержимого. С инженерной точки зрения наиболее рационально обрабатывать не весь HTML-код целиком, а только текстовые узлы документа, которые реально отображаются пользователю. Это снижает вероятность повреждения разметки, упрощает замену отдельных фрагментов текста и позволяет сохранить внешний вид страницы. Анализ должен запускаться автоматически при первоначальной загрузке и повторяться для динамически добавляемого контента, например для комментариев, появляющихся без обновления страницы.</w:t>
-      </w:r>
-    </w:p>
-    <w:p>
-      <w:r>
-        <w:t xml:space="preserve">Первым этапом алгоритма является нормализация текста. На этом этапе слова приводятся к единому регистру, устраняются лишние разделители, </w:t>
-      </w:r>
-      <w:r>
-        <w:lastRenderedPageBreak/>
-        <w:t>учитываются замены похожих символов из разных алфавитов, а также устраняются типичные способы маскировки нежелательных выражений. Если пользователь страницы заменил буквы цифрами, вставил дополнительные символы или разбил слово на несколько фрагментов, система должна по возможности восстановить исходную форму для последующего анализа. Такая предобработка необходима, иначе значительная часть реально используемых обходных написаний останется незамеченной.</w:t>
-      </w:r>
-    </w:p>
-    <w:p>
-      <w:r>
-        <w:t>Второй этап связан с лексико-морфологической проверкой. Простого точного сравнения со словарём недостаточно, поэтому в проекте предлагается ориентироваться на базовые формы слов и устойчивые корни, связанные с бранной лексикой. Иными словами, если в словаре хранится нежелательная лемма, система должна уметь выявлять её производные, разговорные варианты и намеренно искажённые формы. Это особенно важно для русского языка, в котором словообразовательные модели позволяют создавать большое количество вариаций от одного корня.</w:t>
-      </w:r>
-    </w:p>
-    <w:p>
-      <w:r>
-        <w:t>Однако морфологическая чувствительность не должна превращаться в источник постоянных ошибок. Поэтому третий этап алгоритма представляет собой проверку по словарю исключений. Существуют нейтральные слова, внутри которых могут встречаться буквенные последовательности, формально похожие на фрагменты грубых выражений. Если не учитывать такие исключения, фильтр начнёт искажать обычные учебные, официальные и бытовые слова. Следовательно, каждая потенциальная цензура должна проходить дополнительную верификацию: совпадение с подозрительным шаблоном ещё не означает автоматического замещения.</w:t>
-      </w:r>
-    </w:p>
-    <w:p>
-      <w:r>
-        <w:t>Четвёртый этап предполагает выбор действия над обнаруженным фрагментом. В базовом режиме расширение может заменять нежелательное слово на нейтральную заглушку, скрывать часть символов маской или подменять выражение более корректной формой из локального словаря. Выбор конкретного режима должен регулироваться настройками пользователя. В школьной среде, вероятно, более уместен режим полной замены или маскировки, тогда как для исследовательского использования может быть полезно отображение факта срабатывания без полного удаления фрагмента.</w:t>
-      </w:r>
-    </w:p>
-    <w:p>
-      <w:r>
-        <w:t>Пятый этап алгоритма связан с отчётностью и устойчивостью работы. Желательно, чтобы расширение могло фиксировать обезличенную статистику: сколько выражений было заменено на конкретной странице, какие типы правил сработали, не возникло ли неоднозначных случаев. Эта информация не должна нарушать приватность пользователя, но она полезна для совершенствования словаря, пополнения списка исключений и настройки чувствительности фильтра. Такой подход переводит проект из разряда простого списка замен в категорию развивающихся систем.</w:t>
-      </w:r>
-    </w:p>
-    <w:p>
-      <w:r>
-        <w:t xml:space="preserve">Итак, предлагаемый алгоритм фильтрации включает последовательность из нормализации, морфологической проверки, сопоставления с шаблонами, обязательной сверки со списком исключений и последующего корректного замещения текста. Благодаря этому достигается именно тот результат, который требуется для проекта: расширение способно </w:t>
-      </w:r>
-      <w:r>
-        <w:lastRenderedPageBreak/>
-        <w:t>реагировать не только на прямую словоформу, но и на родственные, искажённые и обходные варианты, не разрушая при этом нейтральный текст страницы.</w:t>
+        <w:t>????? ???????? ??????????? ???-???????? ?????????? ????????? ? ??????? ?? ?????????? ???????????. ?? ???????? ?????????????? ?????? ????????? ???? DOM-??????, ??????? ??????? ???????????? ????????????. ??? ????????? ?? ?????????? HTML-???????? ? ???????? ????????? ?????????? ? ??????????? ???????????? ???????? ????? MutationObserver.</w:t>
+      </w:r>
+    </w:p>
+    <w:p>
+      <w:r>
+        <w:t>?????? ?????? ?????? ????????? ???????? ???????????? ???????. ????? ?????????? ? ??????? ????????, ????????? ?? ?????? ????????????, ??????????? ???????? ??????? ???????? ? ???????? ?????????, ? ????? ??? ????????????? ?????????? ? ????? ??? ??? ?????????? ????????. ????????? ????? ?????? ?????????? ???????????? ????? ???????? ?????????.</w:t>
+      </w:r>
+    </w:p>
+    <w:p>
+      <w:r>
+        <w:t>?????? ???? ?????? ? ?????????????? ???? ? ????????? ???????. ? ????????????? ?????? ????????? ???????????? ???????????? ?????? ??????? ? regex-??????? ?? bundle, ??????? ?????????? ?????????? ?? ?????? ??????? ?????, ?? ? ???????????, ???????????? ? ?????????? ????????. ??? ????????? ???????? ?????? ??? ????? ???? ? ??????? ??????, ?????? ? ????, ??????? ????? ???? ???????, ????????????? ? ?????? ???????????.</w:t>
+      </w:r>
+    </w:p>
+    <w:p>
+      <w:r>
+        <w:t>?????? ???? ???????????? ????? ?????? ?? ??????? ??????????. ????? ??????? ?????? ?????????? ??????????? ?? ?????????? ?????? ??????????? ???? ? ???????????????? ??????????. ????? ???? ?????? ????????? ????? ?????? ???????????? ? ?? ????????? ??????? ??????? ??????? ??????? ??? ??????? ?????, ???? ??? ???????? ???????? ??????? ????????? ??????????????????.</w:t>
+      </w:r>
+    </w:p>
+    <w:p>
+      <w:r>
+        <w:t>????????? ???? ? ?????????? ?????? ?????????? ?????????. ? ?????????? ????????????? ????? ?????????? ????????, ??????????? ??????????? ???????? ? ?????? ?????? ?????????????? ??????. ????????? ????? ???????? ? ?????????? ? ????????? ??????????? ?? ???? ??????????? ?? ????????.</w:t>
+      </w:r>
+    </w:p>
+    <w:p>
+      <w:r>
+        <w:t>????? ???? ?????? ? ??????????? ? ????????????? ??????. ????? ????????? ???????? content script ???????? ? service worker ???????????? ??????????: ??????? ????? ???? ?????????, ??????? ????????? ????? ????????? ? ????? ??????? ?????????. ??? ?????? ??????????? ??? ??????? ??????? ? ???????????? ?? ??????????? ???? ?????????? ???? ????? ?????????? ?????????? service worker.</w:t>
+      </w:r>
+    </w:p>
+    <w:p>
+      <w:r>
+        <w:t>????, ????????????? ???????? ?????????? ???????? ?????????????????? ?? ??????? ????????? ?????, ???????????? ???????, ???????? ?? ?????? ???????? ? ????????, ?????? ?? ??????? ?????????? ? ???????????? ??????????? ????????? ??????. ????????? ????? ?????????? ????????? ?? ??????, ???????????? ? ???????? ????? ????????????? ????, ???????? ????????????????? ????????.</w:t>
       </w:r>
     </w:p>
     <w:p>
@@ -1743,12 +1690,12 @@
     </w:p>
     <w:p>
       <w:r>
-        <w:t>Практическая эффективность предлагаемого расширения может оцениваться по нескольким критериям. Первый критерий связан с полнотой блокировки запрещённых ресурсов: система должна своевременно распознавать адреса, включённые во внешний перечень, и предотвращать их открытие до начала полноценного взаимодействия со страницей. Второй критерий касается качества текстовой фильтрации: расширение должно обнаруживать не только точные словоформы, но и родственные, искажённые и обходные варианты нежелательных выражений. Третий критерий определяется числом ложных срабатываний, поскольку чрезмерная агрессивность фильтра ухудшает пользовательский опыт и снижает доверие к системе.</w:t>
-      </w:r>
-    </w:p>
-    <w:p>
-      <w:r>
-        <w:t>Отдельное значение имеет удобство использования. Если интерфейс расширения понятен, а основные режимы доступны без лишних действий, вероятность реального применения инструмента в школьной и домашней среде возрастает. По этой причине важным результатом внедрения следует считать не только техническую работоспособность, но и устойчивое принятие решения пользователем. Расширение должно восприниматься как полезный помощник, а не как помеха при чтении сайтов. Следовательно, параметры уведомлений, способ отображения замен и скорость реакции интерфейса также входят в перечень показателей качества.</w:t>
+        <w:t>???????????? ????????????? ?????????? ?????????? ??????????? ?? ?????????? ????????????. ??-??????, ??????? ?????? ???????????? ???????????? ??????, ?????????? ? ??????????? bundle, ? ??????????? ??????? ?? ?????? ???????????? ?????????????? ?? ?????????. ??-??????, ????????? ?????????? ?????? ???????????? ?? ?????? ?????? ??????????, ?? ? ???????????, ???????????? ? ?????????? ???????? ????????????? ?????????. ?-???????, ?????? ??????????? ???????? ????? ?????? ????????????, ????????? ?????? ??? ?????????? ??????????? ?????????? ??? ????????????? ?????????????.</w:t>
+      </w:r>
+    </w:p>
+    <w:p>
+      <w:r>
+        <w:t>????????? ???????? ????? ???????? ??????????. ? ??????? ?????????? popup ? ???????? ???????? ????????? ?????? ??????? ????????? ???????, ????????? ?????????? ??????, ???????? ?????? ?????????? ? ?????????????? ?????????? ????????? ???????? ?? ????????? ????? ? ??????????? ?????. ??????? ????????? ???????? ????????? ?? ?????? ???????? ??????, ?? ? ?????????? ?????? ?????????? ??? ????????????.</w:t>
       </w:r>
     </w:p>
     <w:p>
@@ -1763,42 +1710,22 @@
     </w:p>
     <w:p>
       <w:r>
-        <w:t>В ходе работы была рассмотрена проблема нецензурной речи и противоправного контента в подростковой интернет-среде. Установлено, что опасность заключается не только в наличии отдельных грубых слов, но и в систематическом воздействии агрессивной, унижающей и запрещённой информации на формирующуюся личность подростка. Это делает задачу фильтрации веб-контента одновременно технической, социальной и правовой.</w:t>
-      </w:r>
-    </w:p>
-    <w:p>
-      <w:r>
-        <w:t>Проведённый анализ нормативных источников показал, что проект браузерного расширения может опираться на существующие правовые механизмы ограничения доступа к запрещённой информации и защиты детей от вредного контента. На этой основе была предложена концепция расширения «Cenz Control», которое сочетает блокирование сайтов по актуализируемым спискам, настраиваемый пользовательский интерфейс и автоматическую фильтрацию текста непосредственно на веб-странице.</w:t>
-      </w:r>
-    </w:p>
-    <w:p>
-      <w:r>
-        <w:t xml:space="preserve">Сформулирована архитектура, при которой единый внешний скрипт-парсер подготавливает обновляемые данные из официальных источников и сохраняет их в </w:t>
-      </w:r>
-      <w:proofErr w:type="spellStart"/>
-      <w:r>
-        <w:t>GitHub</w:t>
-      </w:r>
-      <w:proofErr w:type="spellEnd"/>
-      <w:r>
-        <w:t xml:space="preserve">-репозитории, а расширение при запуске загружает эти файлы и использует их для работы. Описан алгоритм цензурирования, </w:t>
-      </w:r>
-      <w:r>
-        <w:lastRenderedPageBreak/>
-        <w:t>учитывающий нормализацию текста, однокоренные формы, искажённые написания и обязательный список исключений, предотвращающий ложные срабатывания на нейтральных словах.</w:t>
-      </w:r>
-    </w:p>
-    <w:p>
-      <w:r>
-        <w:t xml:space="preserve">Таким образом, поставленная цель достигнута: разработана целостная концепция браузерного расширения для фильтрации нецензурной лексики и ограничения доступа к запрещённым веб-ресурсам. Практическая ценность проекта заключается в возможности дальнейшей реализации без изменения общей логики. Перспективным направлением развития признано подключение технологий искусственного интеллекта, которые позволят не просто скрывать бранные выражения, а выполнять контекстно точную и </w:t>
-      </w:r>
-      <w:proofErr w:type="spellStart"/>
-      <w:r>
-        <w:t>смыслово</w:t>
-      </w:r>
-      <w:proofErr w:type="spellEnd"/>
-      <w:r>
-        <w:t xml:space="preserve"> корректную замену. Это позволит сделать цифровую среду для подростков более безопасной, культурной и образовательной.</w:t>
+        <w:t>? ???? ?????? ???? ???????? ??????????? ???????? ??????????? ???? ? ??????????????? ???????? ? ???????????? ????????-?????. ?????? ???????, ??? ??? ?????? ???????????? ???????????? ???????? ?????? ? ?????????? ???????: ????????? ??????????, ??????? ???????????? ???????????? ?????? ? ??????????? ???????? ? ??????? ??????????? ???????? ?? ?????? ? ??????? ???????.</w:t>
+      </w:r>
+    </w:p>
+    <w:p>
+      <w:r>
+        <w:t>?? ?????? ????????? ??????????? ?????????? ? ???????????? ??????????? ??????? ???? ??????????? ? ??????????? ?????????? ?????????? ?Cenz Control? ?? Manifest V3. ??? ???????? ?????????? ?????? ?? ???????????? ???????? ??????, ???????????????? ?????????, ???????? ??????????? ? ?????????? ? ?????????????? ?????????? ?????? ??????????????? ? ????????.</w:t>
+      </w:r>
+    </w:p>
+    <w:p>
+      <w:r>
+        <w:t>????? ???? ??????????? ??????????? ?????????? ?????? ????? GitHub ? ????????? ??????? ??????. ????????? bundle ?????????? ?????? ??????, ??????? ?????? ? ??????????; ??? ?????????? ?????? ??????????? ???????? ???????????? ??????? ??????????? Re-filter-lists, ??????????? ????????? ?????? ? ?????????????? ?????? ???????? ?????????????. ???????? ?????????????? ????????? ???????????? ??????, ?????? ???????, regex-???????, ???????????? ????? ? ?????? ??????????.</w:t>
+      </w:r>
+    </w:p>
+    <w:p>
+      <w:r>
+        <w:t>????? ???????, ???????????? ???? ??????????: ??????? ?????????? ?????????? ?????????? ??? ?????????? ??????????? ??????? ? ??????????? ??????? ? ??????????? ???-????????. ???????????? ???????? ??????? ??????????? ? ???, ??? ??????? ??? ???????? ??? ??????????? ????????????? ? ?????????? ??? ????????? ????? ???????????. ????????????? ???????????? ???????? ???????? ??????????? ?????????? ?????????????? ?????????? ??? ?????????? ?????? ? ???????? ?????????? ?????? ????????????? ?????????.</w:t>
       </w:r>
     </w:p>
     <w:p>

</xml_diff>

<commit_message>
Fix corrupted project document encoding
</commit_message>
<xml_diff>
--- a/9_Слынчук_ИИ_Проект.docx
+++ b/9_Слынчук_ИИ_Проект.docx
@@ -122,7 +122,7 @@
         </w:rPr>
       </w:pPr>
       <w:r>
-        <w:t>?????????? ??????????? ?????????? ?Cenz Control? ??? ?????????? ??????????? ??????? ? ??????????? ??????? ? ???????????? ???-????????</w:t>
+        <w:t>Разработка браузерного расширения «Cenz Control» для фильтрации нецензурной лексики и ограничения доступа к запрещённому веб-контенту</w:t>
       </w:r>
     </w:p>
     <w:p>
@@ -1289,7 +1289,7 @@
     </w:p>
     <w:p>
       <w:r>
-        <w:t>???????? ???????????? ???????? ????????? ??????? ???-??????? ? ????????? ??????????? ??????? ? ??????? ????????-????????. ??????? ???????????? ?????????? ?????? ?????????????? ?????????? ??????????? ??????? ? ???????????? ???-????????, ?????????? ??????????? ??? ?????????????? ??????????. ???? ?????? ??????????? ? ?????????? ??????????? ?????????? ?Cenz Control?, ??????? ??????????? ??????????? ???????, ???????????? ?????? ? ??????????? ?????? ? ?????????? ??????????? ??????? bundle ?? ???????? ??????, ??????? ? ??????????. ???????????? ??????????? ???????? ???????? ??????????-????????? ?????? ????????????? ????????? ? ?????????????? ?????????????? ??????????.</w:t>
+        <w:t>Объектом исследования является текстовый контент веб-страниц и механизмы ограничения доступа к опасным интернет-ресурсам. Предмет исследования составляют методы автоматической фильтрации нецензурной лексики и блокирования веб-ресурсов, содержащих запрещённую или противоправную информацию. Цель работы заключается в разработке браузерного расширения «Cenz Control», которое цензурирует нецензурную лексику, ограничивает доступ к запрещённым сайтам и использует обновляемый внешний bundle со списками сайтов, словаря и исключений. Перспективой дальнейшего развития остаётся контекстно-зависимая замена нежелательных выражений с использованием искусственного интеллекта.</w:t>
       </w:r>
     </w:p>
     <w:p>
@@ -1505,27 +1505,27 @@
     </w:p>
     <w:p>
       <w:r>
-        <w:t>???????? ??????? ?????????????? ?????????? ??????????? ? ????????????? ??????. ?????? ??????? ?????? ? ???????????? ???????? ??????????? ??????: ???? ????? ????????? ? ???????, hostname ??? ???????? URL ?? ?????? ??????????, ??????? ???????????????? ?? ????????? ???????? ? ???????????? ? ??????? ??????????? ???????. ?????? ??????? ???????? ?? ??????????? ????????? ? ???????? ?? ?????????????? ??????: ?????????? ??????????? ?????????? ???????? ? ???????? ??????????? ? ???? ????????????? ?????????? ??? ??????????? HTML-????????.</w:t>
-      </w:r>
-    </w:p>
-    <w:p>
-      <w:r>
-        <w:t>? ????? ?????? ????????????????? ????? ? ??????? ??????????? ??????????? ???? ??????????, ? ??????? ???????????? ??????? ?????, ????????? ??????? ?????????? ? ??????????, ?????????? ??????????????? ????, ????? ??????????? ????????? ????? ? ???? ?????????? ?????????? bundle. ????????????? ????????????? ????????? ???????? ????????, ??? ????? ???????? ????????? ?????? ? ???????? ??????????? ??????.</w:t>
-      </w:r>
-    </w:p>
-    <w:p>
-      <w:r>
-        <w:t>???????????????? ????????? ???????? ????????? ? ?????????? ????????? ???????, ????? ??????? ????????? ??????????, ????? ?????? ????, ??????????? ?????-????????, ?????? ?????????? ??????, ???????????????? ??????????, ?????? ?? ????????? bundle ? ?????? ??????????????? ??????????. ????????? ????? ???? ? ?? ?? ?????????? ????? ?????????????? ??? ? ???????? ??????, ??? ? ? ??????? ????? ? ????? ???????? ?????????????.</w:t>
-      </w:r>
-    </w:p>
-    <w:p>
-      <w:r>
-        <w:t>????????? ???????? ??????? ???????????? ??????. ??? ?????????? ????? ???????????? ???????????? ????????? ???????? ? ???????????? ? ???, ??? ????????? ??????? ????????? ????????????????? ?????????? ?????????, ? ????? ???????????? ???????? ? ??? ?????????? ???????. ???? ???????? ?? ??????????? ?????????, popup ?????????, ???????? ?? ??????? ???? ? ??????????? ?? ?? ??? ????????? ??????????.</w:t>
-      </w:r>
-    </w:p>
-    <w:p>
-      <w:r>
-        <w:t>????? ???????, ???????????? ?????????? ?Cenz Control? ?????????? ????????, ?????????????? ? ???????????????? ???????. ?????????? ?? ?????? ???????? ?????? ?????????, ?? ? ???????? ???????????? ????????, ????? ??????????? ?????????, ?????? ???????? ?????? ? ? ????? ?????? ??????? ????????? ?? ??????? ????????.</w:t>
+        <w:t>Основная функция реализованного расширения заключается в двухуровневой защите. Первый уровень связан с недопущением загрузки запрещённых сайтов: если адрес совпадает с доменом, hostname или шаблоном URL из списка блокировок, вкладка перенаправляется на отдельную страницу с уведомлением о причине ограничения доступа. Второй уровень работает на разрешённых страницах и отвечает за цензурирование текста: расширение анализирует содержимое страницы и заменяет нецензурные и иные нежелательные словоформы без повреждения HTML-разметки.</w:t>
+      </w:r>
+    </w:p>
+    <w:p>
+      <w:r>
+        <w:t>С точки зрения пользовательского опыта в проекте реализовано всплывающее окно расширения, в котором отображаются текущий домен, состояние модулей фильтрации и блокировки, количество цензурированных слов, число проверенных текстовых узлов и дата последнего обновления bundle. Дополнительно предусмотрена отдельная страница настроек, где можно изменить параметры работы и источник обновляемых данных.</w:t>
+      </w:r>
+    </w:p>
+    <w:p>
+      <w:r>
+        <w:t>Пользовательские настройки включают включение и отключение отдельных модулей, выбор степени строгости фильтрации, режим замены слов, собственное слово-заглушку, список доверенных сайтов, пользовательские исключения, ссылку на удалённый bundle и период автоматического обновления. Благодаря этому одно и то же расширение может использоваться как в домашнем режиме, так и в учебной среде с более строгими ограничениями.</w:t>
+      </w:r>
+    </w:p>
+    <w:p>
+      <w:r>
+        <w:t>Отдельное внимание уделено прозрачности работы. При блокировке сайта пользователю показывается отдельная страница с уведомлением о том, что посещение ресурса запрещено законодательством Российской Федерации, а также отображаются источник и тип совпавшего правила. Если страница не блокируется полностью, popup объясняет, разрешён ли текущий сайт и выполнялась ли на нём текстовая фильтрация.</w:t>
+      </w:r>
+    </w:p>
+    <w:p>
+      <w:r>
+        <w:t>Таким образом, практическая реализация «Cenz Control» объединяет защитную, информационную и пользовательскую функции. Расширение не только скрывает грубые выражения, но и помогает пользователю понимать, какие ограничения сработали, откуда получены данные и в каком режиме система действует на текущей странице.</w:t>
       </w:r>
     </w:p>
     <w:p>
@@ -1545,37 +1545,37 @@
     </w:p>
     <w:p>
       <w:r>
-        <w:t>???????? ?????????? ??????? ???? ??????????? ????? ??????? ?????? ?????????? ??????. ?????? ??????????? ??????, ????????? ??????? ? ?????????? ?????????? ?????????? ?????????, ????????????? ? ?????? bundle-???? ? ????? ????????????? ? GitHub-??????????? ??? ??????? ????? ?????? ??????????.</w:t>
-      </w:r>
-    </w:p>
-    <w:p>
-      <w:r>
-        <w:t>? ??????? ??????????? ???????? ??????? ?????????? ??????? ????????? ??????????? Re-filter-lists, ?? ???????? ????????????? ??????? ?????? domains_all.lst. ? ???? ??????????? ?????????? ????????? adult-??????, ? ????? ????? ???? ?????????? ???????? ????????????? ????? ????????? ??????. ?? ?????? ?????????? ?????? ???????? bundle ???????? ????? 80 ????? ??????? ??? ??????????.</w:t>
-      </w:r>
-    </w:p>
-    <w:p>
-      <w:r>
-        <w:t>??? ?????? ? ??????? ????????????? ??? ??????????? ????????? ??????-??????, ??????? ????? ????????? ???????? ? ???????? XML, CSV, JSON, TXT ? ?????????????? ?????????. ? ???? ?????????? ?? ??? ???????? ?? ???????? sample-????????, ? ??? ??????? ????????? ????? ????? ?????????????? ??? ?????????? ?????? bundle ???????????? ???????.</w:t>
-      </w:r>
-    </w:p>
-    <w:p>
-      <w:r>
-        <w:t>???????? bundle ??????? ?? ???? ???????? ??????. ?????? ????? ? blockedSites, ?????????? ??????, hostname ? URL-??????? ??????????? ????????. ?????? ????? ? dictionary, ?????????? ????????? ???????, ?????? ??????? ? regex-??????? ??? ????????????? ????????????? ?????????. ?????? ????? ? exceptions, ??? ???????? ?????, ?????????? ??????? ?? ?????? ????????????.</w:t>
-      </w:r>
-    </w:p>
-    <w:p>
-      <w:r>
-        <w:t>? ??????? ?? ??????????????? ?????????? ???????, ?????? ???????? ??? ?? ?????? ??????, ?? ? ??????????. ?????? build_bundle.py ???????? ???????? JSON-????, GitHub-???????????? ?????? raw-?????? ?? ?????????????? bundle, ? ???? ?????????? ?????????? ??????? ?????????? ??????? URL ? ?????????? ? GitHub Raw ? ????????? fallback?. ????? ????? ????????? ???????? ? ? ????, ? ??? ????????? ?????????? ??????? ? ?????????? ???????????.</w:t>
-      </w:r>
-    </w:p>
-    <w:p>
-      <w:r>
-        <w:t>?????????????? ?????????? ????????? ?? ???? ???????. ? ????? ?????????? ???????? ???????????? ??????, ??????????? ??????? ????? ??????? bundle, ? ? ??????????? ????? ??????????? GitHub Actions workflow, ??????? ??? ? ?????? ???????????? ?????? ? ????????? ??????????? ????. ????????? ????? ???????????? ???????? ?????????? ?????? ??? ?????? ????????????? ??????????.</w:t>
-      </w:r>
-    </w:p>
-    <w:p>
-      <w:r>
-        <w:t>?????????????, ??????? ?????? ?????????? ?????? ???? ?? ????????????? ???????????, ? ??????????? ?????? ???????? ???????. ?????? ?? ???????????? ????????????? ???????, ????????????????? ?????? ? ??????????? ??????????????? ????????? ?????? ?????? ? ??????? ??????????.</w:t>
+        <w:t>Ключевое требование проекта было реализовано через внешний контур обновления данных. Списки запрещённых сайтов, словарные правила и исключения собираются отдельными скриптами, упаковываются в единый bundle-файл и могут публиковаться в GitHub-репозитории без выпуска новой версии расширения.</w:t>
+      </w:r>
+    </w:p>
+    <w:p>
+      <w:r>
+        <w:t>В текущей архитектуре основным внешним источником доменов выступает репозиторий Re-filter-lists, из которого автоматически берётся список domains_all.lst. К нему добавляется постоянный локальный adult-список, а также может быть подключена выгрузка Роскомнадзора через отдельный парсер. На момент подготовки работы итоговый bundle содержал более 80 тысяч записей для блокировки.</w:t>
+      </w:r>
+    </w:p>
+    <w:p>
+      <w:r>
+        <w:t>Для работы с данными Роскомнадзора был подготовлен отдельный скрипт-парсер, который умеет разбирать выгрузки в форматах XML, CSV, JSON, TXT и архивированных вариантах. В ходе разработки он был проверен на тестовой sample-выгрузке, а при наличии реального файла может использоваться для пополнения общего bundle официальными данными.</w:t>
+      </w:r>
+    </w:p>
+    <w:p>
+      <w:r>
+        <w:t>Итоговый bundle состоит из трёх основных частей. Первая часть — blockedSites, содержащая домены, hostname и URL-шаблоны запрещённых ресурсов. Вторая часть — dictionary, включающая словарные правила, точные термины и regex-шаблоны для распознавания нежелательных словоформ. Третья часть — exceptions, где хранятся слова, защищающие систему от ложных срабатываний.</w:t>
+      </w:r>
+    </w:p>
+    <w:p>
+      <w:r>
+        <w:t>В отличие от первоначального проектного замысла, данный механизм был не только описан, но и реализован. Скрипт build_bundle.py собирает итоговый JSON-файл, GitHub-конфигурация задаёт raw-ссылку на опубликованный bundle, а само расширение использует порядок источников «ручной URL в настройках → GitHub Raw → локальный fallback». Такая схема позволяет работать и в сети, и при временном отсутствии доступа к удалённому репозиторию.</w:t>
+      </w:r>
+    </w:p>
+    <w:p>
+      <w:r>
+        <w:t>Автоматическое обновление выполнено на двух уровнях. В самом расширении настроен еженедельный таймер, проверяющий наличие более свежего bundle, а в репозитории может запускаться GitHub Actions workflow, который раз в неделю пересобирает данные и публикует обновлённый файл. Благодаря этому пользователь получает актуальные списки без ручной переустановки расширения.</w:t>
+      </w:r>
+    </w:p>
+    <w:p>
+      <w:r>
+        <w:t>Следовательно, внешний контур обновления данных стал не теоретическим дополнением, а полноценной частью готового решения. Именно он обеспечивает сопровождение проекта, воспроизводимость сборки и возможность централизованно обновлять списки сайтов и словарь фильтрации.</w:t>
       </w:r>
     </w:p>
     <w:p>
@@ -1590,37 +1590,37 @@
     </w:p>
     <w:p>
       <w:r>
-        <w:t>????? ???????? ??????????? ???-???????? ?????????? ????????? ? ??????? ?? ?????????? ???????????. ?? ???????? ?????????????? ?????? ????????? ???? DOM-??????, ??????? ??????? ???????????? ????????????. ??? ????????? ?? ?????????? HTML-???????? ? ???????? ????????? ?????????? ? ??????????? ???????????? ???????? ????? MutationObserver.</w:t>
-      </w:r>
-    </w:p>
-    <w:p>
-      <w:r>
-        <w:t>?????? ?????? ?????? ????????? ???????? ???????????? ???????. ????? ?????????? ? ??????? ????????, ????????? ?? ?????? ????????????, ??????????? ???????? ??????? ???????? ? ???????? ?????????, ? ????? ??? ????????????? ?????????? ? ????? ??? ??? ?????????? ????????. ????????? ????? ?????? ?????????? ???????????? ????? ???????? ?????????.</w:t>
-      </w:r>
-    </w:p>
-    <w:p>
-      <w:r>
-        <w:t>?????? ???? ?????? ? ?????????????? ???? ? ????????? ???????. ? ????????????? ?????? ????????? ???????????? ???????????? ?????? ??????? ? regex-??????? ?? bundle, ??????? ?????????? ?????????? ?? ?????? ??????? ?????, ?? ? ???????????, ???????????? ? ?????????? ????????. ??? ????????? ???????? ?????? ??? ????? ???? ? ??????? ??????, ?????? ? ????, ??????? ????? ???? ???????, ????????????? ? ?????? ???????????.</w:t>
-      </w:r>
-    </w:p>
-    <w:p>
-      <w:r>
-        <w:t>?????? ???? ???????????? ????? ?????? ?? ??????? ??????????. ????? ??????? ?????? ?????????? ??????????? ?? ?????????? ?????? ??????????? ???? ? ???????????????? ??????????. ????? ???? ?????? ????????? ????? ?????? ???????????? ? ?? ????????? ??????? ??????? ??????? ??????? ??? ??????? ?????, ???? ??? ???????? ???????? ??????? ????????? ??????????????????.</w:t>
-      </w:r>
-    </w:p>
-    <w:p>
-      <w:r>
-        <w:t>????????? ???? ? ?????????? ?????? ?????????? ?????????. ? ?????????? ????????????? ????? ?????????? ????????, ??????????? ??????????? ???????? ? ?????? ?????? ?????????????? ??????. ????????? ????? ???????? ? ?????????? ? ????????? ??????????? ?? ???? ??????????? ?? ????????.</w:t>
-      </w:r>
-    </w:p>
-    <w:p>
-      <w:r>
-        <w:t>????? ???? ?????? ? ??????????? ? ????????????? ??????. ????? ????????? ???????? content script ???????? ? service worker ???????????? ??????????: ??????? ????? ???? ?????????, ??????? ????????? ????? ????????? ? ????? ??????? ?????????. ??? ?????? ??????????? ??? ??????? ??????? ? ???????????? ?? ??????????? ???? ?????????? ???? ????? ?????????? ?????????? service worker.</w:t>
-      </w:r>
-    </w:p>
-    <w:p>
-      <w:r>
-        <w:t>????, ????????????? ???????? ?????????? ???????? ?????????????????? ?? ??????? ????????? ?????, ???????????? ???????, ???????? ?? ?????? ???????? ? ????????, ?????? ?? ??????? ?????????? ? ???????????? ??????????? ????????? ??????. ????????? ????? ?????????? ????????? ?? ??????, ???????????? ? ???????? ????? ????????????? ????, ???????? ????????????????? ????????.</w:t>
+        <w:t>После загрузки разрешённой веб-страницы расширение переходит к анализу её текстового содержимого. На практике обрабатываются только текстовые узлы DOM-дерева, которые реально отображаются пользователю. Это позволяет не повреждать HTML-разметку и повторно применять фильтрацию к динамически добавляемому контенту через MutationObserver.</w:t>
+      </w:r>
+    </w:p>
+    <w:p>
+      <w:r>
+        <w:t>Первым этапом работы алгоритма является нормализация токенов. Слова приводятся к нижнему регистру, очищаются от лишних разделителей, учитываются типичные подмены символов и смешение алфавитов, а буква «ё» дополнительно приводится к форме «е» для унификации проверки. Благодаря этому фильтр распознаёт значительную часть обходных написаний.</w:t>
+      </w:r>
+    </w:p>
+    <w:p>
+      <w:r>
+        <w:t>Второй этап связан с сопоставлением слов с правилами словаря. В реализованной версии алгоритма одновременно используются точные термины и regex-шаблоны из bundle, поэтому расширение распознаёт не только базовые формы, но и производные, приставочные и искажённые варианты. Это оказалось особенно важным для групп слов с корнями «пизд», «бляд» и «ёб», включая формы вида «взъёб», «выёбываться» и другие производные.</w:t>
+      </w:r>
+    </w:p>
+    <w:p>
+      <w:r>
+        <w:t>Третий этап представляет собой сверку со списком исключений. Перед заменой каждое совпадение проверяется по отдельному набору нейтральных слов и пользовательских исключений. Такой слой защиты уменьшает число ложных срабатываний и не позволяет фильтру портить обычные учебные или бытовые слова, если они случайно содержат похожую буквенную последовательность.</w:t>
+      </w:r>
+    </w:p>
+    <w:p>
+      <w:r>
+        <w:t>Четвёртый этап — собственно замена найденного фрагмента. В расширении предусмотрены режим маскировки символов, подстановка нейтральной заглушки и мягкая замена подготовленным словом. Выбранный режим хранится в настройках и одинаково применяется ко всем совпадениям на странице.</w:t>
+      </w:r>
+    </w:p>
+    <w:p>
+      <w:r>
+        <w:t>Пятый этап связан с отчётностью и устойчивостью работы. После обработки страницы content script передаёт в service worker обезличенную статистику: сколько замен было выполнено, сколько текстовых узлов проверено и какие правила сработали. Эти данные сохраняются для текущей вкладки и отображаются во всплывающем окне расширения даже после временного завершения service worker.</w:t>
+      </w:r>
+    </w:p>
+    <w:p>
+      <w:r>
+        <w:t>Итак, реализованный алгоритм фильтрации включает последовательность из выборки текстовых узлов, нормализации токенов, проверки по точным терминам и шаблонам, сверки со списком исключений и последующего корректного замещения текста. Благодаря этому расширение реагирует на прямые, однокоренные и обходные формы нежелательных слов, сохраняя работоспособность страницы.</w:t>
       </w:r>
     </w:p>
     <w:p>
@@ -1690,12 +1690,12 @@
     </w:p>
     <w:p>
       <w:r>
-        <w:t>???????????? ????????????? ?????????? ?????????? ??????????? ?? ?????????? ????????????. ??-??????, ??????? ?????? ???????????? ???????????? ??????, ?????????? ? ??????????? bundle, ? ??????????? ??????? ?? ?????? ???????????? ?????????????? ?? ?????????. ??-??????, ????????? ?????????? ?????? ???????????? ?? ?????? ?????? ??????????, ?? ? ???????????, ???????????? ? ?????????? ???????? ????????????? ?????????. ?-???????, ?????? ??????????? ???????? ????? ?????? ????????????, ????????? ?????? ??? ?????????? ??????????? ?????????? ??? ????????????? ?????????????.</w:t>
-      </w:r>
-    </w:p>
-    <w:p>
-      <w:r>
-        <w:t>????????? ???????? ????? ???????? ??????????. ? ??????? ?????????? popup ? ???????? ???????? ????????? ?????? ??????? ????????? ???????, ????????? ?????????? ??????, ???????? ?????? ?????????? ? ?????????????? ?????????? ????????? ???????? ?? ????????? ????? ? ??????????? ?????. ??????? ????????? ???????? ????????? ?? ?????? ???????? ??????, ?? ? ?????????? ?????? ?????????? ??? ????????????.</w:t>
+        <w:t>Практическая эффективность созданного расширения оценивается по нескольким направлениям. Во-первых, система должна своевременно распознавать адреса, включённые в обновляемый bundle, и блокировать переход до начала полноценного взаимодействия со страницей. Во-вторых, текстовая фильтрация должна обнаруживать не только точные словоформы, но и производные, приставочные и искажённые варианты нежелательных выражений. В-третьих, важным показателем остаётся число ложных срабатываний, поскольку именно оно определяет пригодность расширения для повседневного использования.</w:t>
+      </w:r>
+    </w:p>
+    <w:p>
+      <w:r>
+        <w:t>Отдельное значение имеет удобство интерфейса. В текущей реализации popup и страница настроек позволяют быстро увидеть состояние модулей, запустить обновление данных, изменить режимы фильтрации и контролировать результаты обработки страницы по счётчикам замен и проверенных узлов. Поэтому критерием качества выступает не только точность правил, но и понятность работы расширения для пользователя.</w:t>
       </w:r>
     </w:p>
     <w:p>
@@ -1710,22 +1710,22 @@
     </w:p>
     <w:p>
       <w:r>
-        <w:t>? ???? ?????? ???? ???????? ??????????? ???????? ??????????? ???? ? ??????????????? ???????? ? ???????????? ????????-?????. ?????? ???????, ??? ??? ?????? ???????????? ???????????? ???????? ?????? ? ?????????? ???????: ????????? ??????????, ??????? ???????????? ???????????? ?????? ? ??????????? ???????? ? ??????? ??????????? ???????? ?? ?????? ? ??????? ???????.</w:t>
-      </w:r>
-    </w:p>
-    <w:p>
-      <w:r>
-        <w:t>?? ?????? ????????? ??????????? ?????????? ? ???????????? ??????????? ??????? ???? ??????????? ? ??????????? ?????????? ?????????? ?Cenz Control? ?? Manifest V3. ??? ???????? ?????????? ?????? ?? ???????????? ???????? ??????, ???????????????? ?????????, ???????? ??????????? ? ?????????? ? ?????????????? ?????????? ?????? ??????????????? ? ????????.</w:t>
-      </w:r>
-    </w:p>
-    <w:p>
-      <w:r>
-        <w:t>????? ???? ??????????? ??????????? ?????????? ?????? ????? GitHub ? ????????? ??????? ??????. ????????? bundle ?????????? ?????? ??????, ??????? ?????? ? ??????????; ??? ?????????? ?????? ??????????? ???????? ???????????? ??????? ??????????? Re-filter-lists, ??????????? ????????? ?????? ? ?????????????? ?????? ???????? ?????????????. ???????? ?????????????? ????????? ???????????? ??????, ?????? ???????, regex-???????, ???????????? ????? ? ?????? ??????????.</w:t>
-      </w:r>
-    </w:p>
-    <w:p>
-      <w:r>
-        <w:t>????? ???????, ???????????? ???? ??????????: ??????? ?????????? ?????????? ?????????? ??? ?????????? ??????????? ??????? ? ??????????? ??????? ? ??????????? ???-????????. ???????????? ???????? ??????? ??????????? ? ???, ??? ??????? ??? ???????? ??? ??????????? ????????????? ? ?????????? ??? ????????? ????? ???????????. ????????????? ???????????? ???????? ???????? ??????????? ?????????? ?????????????? ?????????? ??? ?????????? ?????? ? ???????? ?????????? ?????? ????????????? ?????????.</w:t>
+        <w:t>В ходе работы была подробно рассмотрена проблема нецензурной речи и противоправного контента в подростковой интернет-среде. Анализ показал, что для защиты пользователя недостаточно бороться только с отдельными словами: необходим инструмент, который одновременно ограничивает доступ к запрещённым ресурсам и очищает разрешённые страницы от грубой и опасной лексики.</w:t>
+      </w:r>
+    </w:p>
+    <w:p>
+      <w:r>
+        <w:t>На основе изученных нормативных источников и существующих технических решений было разработано и реализовано браузерное расширение «Cenz Control» на Manifest V3. Оно сочетает блокировку сайтов по обновляемому внешнему списку, пользовательские настройки, страницу уведомления о блокировке и автоматическую фильтрацию текста непосредственно в браузере.</w:t>
+      </w:r>
+    </w:p>
+    <w:p>
+      <w:r>
+        <w:t>Также была реализована архитектура обновления данных через GitHub и локальные скрипты сборки. Отдельный bundle объединяет списки сайтов, словарь правил и исключения; для пополнения списка запрещённых ресурсов используются внешний репозиторий Re-filter-lists, статические локальные списки и подготовленный парсер выгрузок Роскомнадзора. Алгоритм цензурирования учитывает нормализацию текста, точные термины, regex-шаблоны, однокоренные формы и список исключений.</w:t>
+      </w:r>
+    </w:p>
+    <w:p>
+      <w:r>
+        <w:t>Таким образом, поставленная цель достигнута: создано работающее браузерное расширение для фильтрации нецензурной лексики и ограничения доступа к запрещённым веб-ресурсам. Практическая ценность проекта заключается в том, что решение уже пригодно для дальнейшего сопровождения и расширения без изменения общей архитектуры. Перспективным направлением развития остаётся подключение технологий искусственного интеллекта для контекстно точной и смыслово корректной замены нежелательных выражений.</w:t>
       </w:r>
     </w:p>
     <w:p>

</xml_diff>